<commit_message>
Add certifications showcase and refresh single-page resume exports.
Surface all 14 credentials with filterable cards, verify links, and date-sorted layout; regenerate resume HTML/PDF/DOCX to match.

Co-authored-by: Cursor <cursoragent@cursor.com>
</commit_message>
<xml_diff>
--- a/docs/resume.docx
+++ b/docs/resume.docx
@@ -4,7 +4,7 @@
   <w:body>
     <w:p>
       <w:r>
-        <w:t>Rihan Mohammed — Full Stack Developer @import url('https://fonts.googleapis.com/css2?family=Inter:wght@300;400;500;600;700;800&amp;family=JetBrains+Mono:wght@400;500&amp;display=swap'); :root { --primary: #0f766e; --primary-dark: #0d5c56; --accent: #f59e0b; --text: #1e293b; --text-muted: #64748b; --border: #e2e8f0; --bg: #ffffff; --sidebar: #0f172a; --sidebar-text: #cbd5e1; } * { margin: 0; padding: 0; box-sizing: border-box; } body { font-family: 'Inter', -apple-system, BlinkMacSystemFont, sans-serif; color: var(--text); background: #f1f5f9; line-height: 1.55; font-size: 10.5pt; } .page { max-width: 900px; margin: 24px auto; background: var(--bg); box-shadow: 0 25px 50px -12px rgba(0,0,0,.15); display: grid; grid-template-columns: 280px 1fr; min-height: 1120px; } /* Sidebar */ .sidebar { background: linear-gradient(175deg, var(--sidebar) 0%, #1e293b 100%); color: var(--sidebar-text); padding: 36px 28px; } .sidebar h1 { font-size: 22px; font-weight: 800; color: #fff; line-height: 1.2; margin-bottom: 4px; } .sidebar .title { font-size: 11px; font-weight: 600; color: var(--accent); text-transform: uppercase; letter-spacing: 1.5px; margin-bottom: 28px; } .sidebar-section { margin-bottom: 26px; } .sidebar-section h2 { font-size: 9px; font-weight: 700; text-transform: uppercase; letter-spacing: 2px; color: var(--primary); margin-bottom: 12px; padding-bottom: 6px; border-bottom: 1px solid rgba(255,255,255,.12); } .contact-item { display: flex; align-items: flex-start; gap: 10px; margin-bottom: 10px; font-size: 10px; line-height: 1.45; } .contact-item .icon { width: 16px; height: 16px; flex-shrink: 0; color: var(--accent); margin-top: 1px; display: flex; align-items: center; justify-content: center; } .contact-item .icon svg { width: 14px; height: 14px; fill: currentColor; display: block; } .skill-group { margin-bottom: 14px; } .skill-group h3 { font-size: 9.5px; font-weight: 600; color: #94a3b8; margin-bottom: 6px; } .skill-tags { display: flex; flex-wrap: wrap; gap: 5px; } .skill-tag { background: rgba(255,255,255,.08); border: 1px solid rgba(255,255,255,.12); border-radius: 4px; padding: 3px 8px; font-size: 8.5px; font-weight: 500; color: #e2e8f0; } /* Main content */ .main { padding: 36px 36px 36px 32px; } .summary { font-size: 10.5px; color: var(--text-muted); line-height: 1.65; margin-bottom: 28px; padding-bottom: 24px; border-bottom: 2px solid var(--border); } .section { margin-bottom: 26px; } .section-header { display: flex; align-items: center; gap: 10px; margin-bottom: 16px; } .section-header h2 { font-size: 13px; font-weight: 800; text-transform: uppercase; letter-spacing: 1.2px; color: var(--primary-dark); white-space: nowrap; } .section-header .line { flex: 1; height: 2px; background: linear-gradient(90deg, var(--primary), transparent); } /* Experience */ .job { margin-bottom: 22px; } .job-header { display: flex; justify-content: space-between; align-items: flex-start; margin-bottom: 4px; } .job-title { font-size: 12.5px; font-weight: 700; color: var(--text); } .job-company { font-size: 11px; font-weight: 600; color: var(--primary); } .job-meta { text-align: right; font-size: 9.5px; color: var(--text-muted); white-space: nowrap; } .job-meta .duration { font-weight: 600; color: var(--text); } .job-desc { font-size: 10px; color: var(--text-muted); margin: 6px 0 8px; font-style: italic; } .job ul { list-style: none; padding: 0; } .job ul li { position: relative; padding-left: 14px; margin-bottom: 5px; font-size: 10px; line-height: 1.55; color: var(--text); } .job ul li::before { content: '▸'; position: absolute; left: 0; color: var(--primary); font-weight: 700; } .job ul li strong { color: var(--text); font-weight: 600; } /* Projects grid */ .projects-grid { display: grid; grid-template-columns: 1fr 1fr; gap: 12px; } .project-card { border: 1px solid var(--border); border-radius: 8px; padding: 12px 14px; background: #fafbfc; } .project-card h3 { font-size: 10.5px; font-weight: 700; color: var(--primary-dark); margin-bottom: 4px; } .project-card .stack { font-family: 'JetBrains Mono', monospace; font-size: 7.5px; color: var(--accent); margin-bottom: 6px; } .project-card p { font-size: 9px; color: var(--text-muted); line-height: 1.5; } /* Education placeholder */ .edu-item { display: flex; justify-content: space-between; align-items: baseline; } .edu-item .degree { font-weight: 600; font-size: 11px; } .edu-item .school { font-size: 10px; color: var(--primary); } .edu-item .year { font-size: 9.5px; color: var(--text-muted); } @media print { body { background: #fff; } .page { margin: 0; box-shadow: none; max-width: 100%; width: 100%; display: grid; grid-template-columns: 280px 1fr; min-height: auto; } .sidebar { break-inside: avoid; page-break-inside: avoid; padding: 24px 28px; } .main { padding: 24px 32px; } .job { break-inside: avoid; page-break-inside: avoid; } .project-card { break-inside: avoid; page-break-inside: avoid; } .section { break-inside: auto; } } @page { size: A4; margin: 0; } Rihan Mohammed</w:t>
+        <w:t>Rihan Mohammed — Full Stack Developer @import url('https://fonts.googleapis.com/css2?family=Inter:wght@300;400;500;600;700;800&amp;family=JetBrains+Mono:wght@400;500&amp;display=swap'); :root { --primary: #0f766e; --primary-dark: #0d5c56; --accent: #f59e0b; --text: #1e293b; --text-muted: #64748b; --border: #e2e8f0; --bg: #ffffff; --sidebar: #0f172a; --sidebar-text: #cbd5e1; } * { margin: 0; padding: 0; box-sizing: border-box; } body { font-family: 'Inter', -apple-system, BlinkMacSystemFont, sans-serif; color: var(--text); background: #f1f5f9; line-height: 1.55; font-size: 10.5pt; } .page { max-width: 900px; margin: 24px auto; background: var(--bg); box-shadow: 0 25px 50px -12px rgba(0,0,0,.15); display: grid; grid-template-columns: 280px 1fr; min-height: 1120px; } /* Sidebar */ .sidebar { background: linear-gradient(175deg, var(--sidebar) 0%, #1e293b 100%); color: var(--sidebar-text); padding: 36px 28px; } .sidebar h1 { font-size: 22px; font-weight: 800; color: #fff; line-height: 1.2; margin-bottom: 4px; } .sidebar .title { font-size: 11px; font-weight: 600; color: var(--accent); text-transform: uppercase; letter-spacing: 1.5px; margin-bottom: 28px; } .sidebar-section { margin-bottom: 26px; } .sidebar-section h2 { font-size: 9px; font-weight: 700; text-transform: uppercase; letter-spacing: 2px; color: var(--primary); margin-bottom: 12px; padding-bottom: 6px; border-bottom: 1px solid rgba(255,255,255,.12); } .contact-item { display: flex; align-items: flex-start; gap: 10px; margin-bottom: 10px; font-size: 10px; line-height: 1.45; } .contact-item .icon { width: 16px; height: 16px; flex-shrink: 0; color: var(--accent); margin-top: 1px; display: flex; align-items: center; justify-content: center; } .contact-item .icon svg { width: 14px; height: 14px; fill: currentColor; display: block; } .skill-group { margin-bottom: 14px; } .skill-group h3 { font-size: 9.5px; font-weight: 600; color: #94a3b8; margin-bottom: 6px; } .skill-tags { display: flex; flex-wrap: wrap; gap: 5px; } .skill-tag { background: rgba(255,255,255,.08); border: 1px solid rgba(255,255,255,.12); border-radius: 4px; padding: 3px 8px; font-size: 8.5px; font-weight: 500; color: #e2e8f0; } /* Main content */ .main { padding: 36px 36px 36px 32px; } .summary { font-size: 10.5px; color: var(--text-muted); line-height: 1.65; margin-bottom: 28px; padding-bottom: 24px; border-bottom: 2px solid var(--border); } .section { margin-bottom: 26px; } .section-header { display: flex; align-items: center; gap: 10px; margin-bottom: 16px; } .section-header h2 { font-size: 13px; font-weight: 800; text-transform: uppercase; letter-spacing: 1.2px; color: var(--primary-dark); white-space: nowrap; } .section-header .line { flex: 1; height: 2px; background: linear-gradient(90deg, var(--primary), transparent); } /* Experience */ .job { margin-bottom: 22px; } .job-header { display: flex; justify-content: space-between; align-items: flex-start; margin-bottom: 4px; } .job-title { font-size: 12.5px; font-weight: 700; color: var(--text); } .job-company { font-size: 11px; font-weight: 600; color: var(--primary); } .job-meta { text-align: right; font-size: 9.5px; color: var(--text-muted); white-space: nowrap; } .job-meta .duration { font-weight: 600; color: var(--text); } .job-desc { font-size: 10px; color: var(--text-muted); margin: 6px 0 8px; font-style: italic; } .job ul { list-style: none; padding: 0; } .job ul li { position: relative; padding-left: 14px; margin-bottom: 5px; font-size: 10px; line-height: 1.55; color: var(--text); } .job ul li::before { content: '▸'; position: absolute; left: 0; color: var(--primary); font-weight: 700; } .job ul li strong { color: var(--text); font-weight: 600; } /* Projects grid */ .projects-grid { display: grid; grid-template-columns: 1fr 1fr; gap: 12px; } .project-card { border: 1px solid var(--border); border-radius: 8px; padding: 12px 14px; background: #fafbfc; } .project-card h3 { font-size: 10.5px; font-weight: 700; color: var(--primary-dark); margin-bottom: 4px; } .project-card .stack { font-family: 'JetBrains Mono', monospace; font-size: 7.5px; color: var(--accent); margin-bottom: 6px; } .project-card p { font-size: 9px; color: var(--text-muted); line-height: 1.5; } /* Education placeholder */ .edu-item { display: flex; justify-content: space-between; align-items: baseline; } .edu-item .degree { font-weight: 600; font-size: 11px; } .edu-item .school { font-size: 10px; color: var(--primary); } .edu-item .year { font-size: 9.5px; color: var(--text-muted); } .cert-grid { display: grid; grid-template-columns: 1fr 1fr; gap: 4px 16px; } .cert-item { font-size: 9px; line-height: 1.4; color: var(--text); padding-left: 10px; position: relative; } .cert-item::before { content: '▸'; position: absolute; left: 0; color: var(--primary); font-weight: 700; font-size: 8px; } @media print { html, body { width: 210mm; height: 297mm; overflow: hidden; } body { background: #fff; font-size: 8pt; line-height: 1.32; } .page { margin: 0; box-shadow: none; max-width: 100%; width: 210mm; height: 297mm; display: grid; grid-template-columns: 220px 1fr; min-height: auto; overflow: hidden; page-break-after: avoid; page-break-inside: avoid; } .sidebar { padding: 14px 16px; break-inside: auto; page-break-inside: auto; } .sidebar h1 { font-size: 17px; margin-bottom: 2px; } .sidebar .title { font-size: 9px; margin-bottom: 14px; } .sidebar-section { margin-bottom: 12px; } .sidebar-section h2 { font-size: 7.5px; margin-bottom: 6px; padding-bottom: 4px; } .contact-item { margin-bottom: 5px; font-size: 8px; gap: 6px; } .skill-group { margin-bottom: 8px; } .skill-group h3 { font-size: 8px; margin-bottom: 3px; } .skill-tag { font-size: 7px; padding: 2px 5px; } .main { padding: 14px 18px 10px 16px; } .summary { font-size: 8px; line-height: 1.45; margin-bottom: 10px; padding-bottom: 8px; } .section { margin-bottom: 10px; } .section-header { margin-bottom: 8px; gap: 6px; } .section-header h2 { font-size: 10px; } .job { margin-bottom: 8px; break-inside: auto; page-break-inside: auto; } .job-title { font-size: 10px; } .job-company { font-size: 9px; } .job-meta { font-size: 8px; } .job-desc { font-size: 8px; margin: 3px 0 4px; } .job ul li { margin-bottom: 2px; font-size: 7.8px; line-height: 1.35; padding-left: 11px; } .projects-grid { gap: 5px; } .project-card { padding: 5px 7px; break-inside: auto; page-break-inside: auto; } .project-card h3 { font-size: 8.5px; margin-bottom: 2px; } .project-card .stack { font-size: 6.5px; margin-bottom: 3px; } .project-card p { font-size: 7.2px; line-height: 1.35; } .edu-item .degree { font-size: 9px; } .edu-item .school { font-size: 8px; } .cert-grid { grid-template-columns: 1fr 1fr 1fr; gap: 1px 8px; } .cert-item { font-size: 6.8px; line-height: 1.28; padding-left: 8px; } .cert-item::before { font-size: 6.5px; } } @page { size: A4; margin: 0; } body { font-size: 8pt; line-height: 1.32; } .page { max-width: 210mm; display: block; } .sidebar { padding: 14px 16px; } .sidebar h1 { font-size: 17px; } .sidebar .title { font-size: 9px; margin-bottom: 14px; } .sidebar-section { margin-bottom: 12px; } .contact-item { font-size: 8px; margin-bottom: 5px; } .skill-tag { font-size: 7px; padding: 2px 5px; } .main { padding: 14px 18px 10px 16px; } .summary { font-size: 8px; line-height: 1.45; margin-bottom: 10px; padding-bottom: 8px; } .section { margin-bottom: 10px; } .section-header { margin-bottom: 8px; } .section-header h2 { font-size: 10px; } .job { margin-bottom: 8px; } .job-title { font-size: 10px; } .job ul li { font-size: 7.8px; line-height: 1.35; margin-bottom: 2px; } .projects-grid { gap: 5px; } .project-card { padding: 5px 7px; } .project-card h3 { font-size: 8.5px; } .project-card p { font-size: 7.2px; line-height: 1.35; } .cert-grid { display: grid; grid-template-columns: 1fr 1fr 1fr; gap: 1px 8px; } .cert-item { font-size: 6.8px; line-height: 1.28; } Rihan Mohammed</w:t>
       </w:r>
     </w:p>
     <w:p>
@@ -432,39 +432,35 @@
       </w:pPr>
     </w:p>
     <w:p>
-      <w:pPr>
-        <w:pStyle w:val="ListBullet"/>
-        <w:ind w:left="280"/>
-      </w:pPr>
       <w:r>
-        <w:t>▸ Practical Database Course for Beginners: 6 courses in 1</w:t>
-      </w:r>
-    </w:p>
-    <w:p>
-      <w:pPr>
-        <w:pStyle w:val="ListBullet"/>
-        <w:ind w:left="280"/>
-      </w:pPr>
-      <w:r>
-        <w:t>▸ Build an Amazon Affiliate E-Commerce Store from Scratch</w:t>
-      </w:r>
-    </w:p>
-    <w:p>
-      <w:pPr>
-        <w:pStyle w:val="ListBullet"/>
-        <w:ind w:left="280"/>
-      </w:pPr>
-      <w:r>
-        <w:t>▸ Introduction to Programming Using HTML and CSS</w:t>
-      </w:r>
-    </w:p>
-    <w:p>
-      <w:pPr>
-        <w:pStyle w:val="ListBullet"/>
-        <w:ind w:left="280"/>
-      </w:pPr>
-      <w:r>
-        <w:t>▸ JavaScript Algorithms and Data Structures</w:t>
+        <w:t>Web Development Masterclass — Udemy</w:t>
+        <w:t xml:space="preserve"> </w:t>
+        <w:t>Python 3 Ultimate Guide — Udemy</w:t>
+        <w:t xml:space="preserve"> </w:t>
+        <w:t>React Complete Guide (Hooks &amp; Redux) — Udemy</w:t>
+        <w:t xml:space="preserve"> </w:t>
+        <w:t>Practical Database Course (6 in 1) — Udemy</w:t>
+        <w:t xml:space="preserve"> </w:t>
+        <w:t>Amazon Affiliate E-Commerce Store — Udemy</w:t>
+        <w:t xml:space="preserve"> </w:t>
+        <w:t>Practical MongoDB + PHP — Udemy</w:t>
+        <w:t xml:space="preserve"> </w:t>
+        <w:t>Complete NodeJS (Express, Socket.io, MongoDB) — Udemy</w:t>
+        <w:t xml:space="preserve"> </w:t>
+        <w:t>PGDCA — Survey Institute Gulf Training</w:t>
+        <w:t xml:space="preserve"> </w:t>
+        <w:t>JavaScript, Bootstrap &amp; PHP — Udemy</w:t>
+        <w:t xml:space="preserve"> </w:t>
+        <w:t>Javascript &amp; JQuery — Udemy</w:t>
+        <w:t xml:space="preserve"> </w:t>
+        <w:t>Adobe Photoshop CC 2015 — Udemy</w:t>
+        <w:t xml:space="preserve"> </w:t>
+        <w:t>HTML &amp; CSS Programming — Udemy</w:t>
+        <w:t xml:space="preserve"> </w:t>
+        <w:t>JS Algorithms &amp; Data Structures — freeCodeCamp</w:t>
+        <w:t xml:space="preserve"> </w:t>
+        <w:t>Responsive Web Design — freeCodeCamp</w:t>
+        <w:t xml:space="preserve"> </w:t>
       </w:r>
     </w:p>
     <w:sectPr>

</xml_diff>